<commit_message>
removed restrictions for the quote expiry date and also added the Google MyDrive/SharedDrive-Google MyDrive/SharedDrive
</commit_message>
<xml_diff>
--- a/backend-exhibits/Google My Drive & Share Drive to Google My Drive & Share  Drive std Inscope.docx
+++ b/backend-exhibits/Google My Drive & Share Drive to Google My Drive & Share  Drive std Inscope.docx
@@ -44,17 +44,12 @@
             <w:pPr>
               <w:ind w:right="12"/>
               <w:jc w:val="center"/>
-              <w:rPr>
-                <w:sz w:val="21"/>
-                <w:szCs w:val="21"/>
-              </w:rPr>
-            </w:pPr>
-            <w:r>
-              <w:rPr>
-                <w:rFonts w:ascii="Arial" w:eastAsia="Arial" w:hAnsi="Arial" w:cs="Arial"/>
-                <w:b/>
-                <w:sz w:val="21"/>
-                <w:szCs w:val="21"/>
+            </w:pPr>
+            <w:r>
+              <w:rPr>
+                <w:rFonts w:ascii="Arial" w:eastAsia="Arial" w:hAnsi="Arial" w:cs="Arial"/>
+                <w:b/>
+                <w:sz w:val="21"/>
               </w:rPr>
               <w:t>INCLUDED IN GOOGLE SHARED DRIVE TO GOOGLE SHARED DRIVE MIGRATION FEATURES</w:t>
             </w:r>
@@ -78,17 +73,12 @@
           <w:p>
             <w:pPr>
               <w:ind w:left="3"/>
-              <w:rPr>
-                <w:sz w:val="21"/>
-                <w:szCs w:val="21"/>
-              </w:rPr>
-            </w:pPr>
-            <w:r>
-              <w:rPr>
-                <w:rFonts w:ascii="Arial" w:eastAsia="Arial" w:hAnsi="Arial" w:cs="Arial"/>
-                <w:b/>
-                <w:sz w:val="21"/>
-                <w:szCs w:val="21"/>
+            </w:pPr>
+            <w:r>
+              <w:rPr>
+                <w:rFonts w:ascii="Arial" w:eastAsia="Arial" w:hAnsi="Arial" w:cs="Arial"/>
+                <w:b/>
+                <w:sz w:val="19"/>
               </w:rPr>
               <w:t>Preserving File/Folder structure</w:t>
             </w:r>
@@ -106,18 +96,11 @@
             <w:vAlign w:val="center"/>
           </w:tcPr>
           <w:p>
-            <w:pPr>
-              <w:rPr>
-                <w:sz w:val="21"/>
-                <w:szCs w:val="21"/>
-              </w:rPr>
-            </w:pPr>
             <w:proofErr w:type="spellStart"/>
             <w:r>
               <w:rPr>
                 <w:rFonts w:ascii="Arial" w:eastAsia="Arial" w:hAnsi="Arial" w:cs="Arial"/>
-                <w:sz w:val="21"/>
-                <w:szCs w:val="21"/>
+                <w:sz w:val="19"/>
               </w:rPr>
               <w:t>CloudFuze</w:t>
             </w:r>
@@ -125,8 +108,7 @@
             <w:r>
               <w:rPr>
                 <w:rFonts w:ascii="Arial" w:eastAsia="Arial" w:hAnsi="Arial" w:cs="Arial"/>
-                <w:sz w:val="21"/>
-                <w:szCs w:val="21"/>
+                <w:sz w:val="19"/>
               </w:rPr>
               <w:t xml:space="preserve"> ensures the seamless migration of the data from the source cloud to destination, preserving the accuracy and integrity of the data structure.</w:t>
             </w:r>
@@ -150,17 +132,12 @@
           <w:p>
             <w:pPr>
               <w:ind w:left="3"/>
-              <w:rPr>
-                <w:sz w:val="21"/>
-                <w:szCs w:val="21"/>
-              </w:rPr>
-            </w:pPr>
-            <w:r>
-              <w:rPr>
-                <w:rFonts w:ascii="Arial" w:eastAsia="Arial" w:hAnsi="Arial" w:cs="Arial"/>
-                <w:b/>
-                <w:sz w:val="21"/>
-                <w:szCs w:val="21"/>
+            </w:pPr>
+            <w:r>
+              <w:rPr>
+                <w:rFonts w:ascii="Arial" w:eastAsia="Arial" w:hAnsi="Arial" w:cs="Arial"/>
+                <w:b/>
+                <w:sz w:val="19"/>
               </w:rPr>
               <w:t>Onetime</w:t>
             </w:r>
@@ -177,17 +154,10 @@
             </w:tcBorders>
           </w:tcPr>
           <w:p>
-            <w:pPr>
-              <w:rPr>
-                <w:sz w:val="21"/>
-                <w:szCs w:val="21"/>
-              </w:rPr>
-            </w:pPr>
-            <w:r>
-              <w:rPr>
-                <w:rFonts w:ascii="Arial" w:eastAsia="Arial" w:hAnsi="Arial" w:cs="Arial"/>
-                <w:sz w:val="21"/>
-                <w:szCs w:val="21"/>
+            <w:r>
+              <w:rPr>
+                <w:rFonts w:ascii="Arial" w:eastAsia="Arial" w:hAnsi="Arial" w:cs="Arial"/>
+                <w:sz w:val="19"/>
               </w:rPr>
               <w:t>The initial data migration from source to destination is considered as One-time migration.</w:t>
             </w:r>
@@ -211,17 +181,12 @@
           <w:p>
             <w:pPr>
               <w:ind w:left="3"/>
-              <w:rPr>
-                <w:sz w:val="21"/>
-                <w:szCs w:val="21"/>
-              </w:rPr>
-            </w:pPr>
-            <w:r>
-              <w:rPr>
-                <w:rFonts w:ascii="Arial" w:eastAsia="Arial" w:hAnsi="Arial" w:cs="Arial"/>
-                <w:b/>
-                <w:sz w:val="21"/>
-                <w:szCs w:val="21"/>
+            </w:pPr>
+            <w:r>
+              <w:rPr>
+                <w:rFonts w:ascii="Arial" w:eastAsia="Arial" w:hAnsi="Arial" w:cs="Arial"/>
+                <w:b/>
+                <w:sz w:val="19"/>
               </w:rPr>
               <w:t>Delta</w:t>
             </w:r>
@@ -238,17 +203,10 @@
             </w:tcBorders>
           </w:tcPr>
           <w:p>
-            <w:pPr>
-              <w:rPr>
-                <w:sz w:val="21"/>
-                <w:szCs w:val="21"/>
-              </w:rPr>
-            </w:pPr>
-            <w:r>
-              <w:rPr>
-                <w:rFonts w:ascii="Arial" w:eastAsia="Arial" w:hAnsi="Arial" w:cs="Arial"/>
-                <w:sz w:val="21"/>
-                <w:szCs w:val="21"/>
+            <w:r>
+              <w:rPr>
+                <w:rFonts w:ascii="Arial" w:eastAsia="Arial" w:hAnsi="Arial" w:cs="Arial"/>
+                <w:sz w:val="19"/>
               </w:rPr>
               <w:t>Migration of incremental changes made in source during the onetime migration.</w:t>
             </w:r>
@@ -273,17 +231,12 @@
           <w:p>
             <w:pPr>
               <w:ind w:left="3"/>
-              <w:rPr>
-                <w:sz w:val="21"/>
-                <w:szCs w:val="21"/>
-              </w:rPr>
-            </w:pPr>
-            <w:r>
-              <w:rPr>
-                <w:rFonts w:ascii="Arial" w:eastAsia="Arial" w:hAnsi="Arial" w:cs="Arial"/>
-                <w:b/>
-                <w:sz w:val="21"/>
-                <w:szCs w:val="21"/>
+            </w:pPr>
+            <w:r>
+              <w:rPr>
+                <w:rFonts w:ascii="Arial" w:eastAsia="Arial" w:hAnsi="Arial" w:cs="Arial"/>
+                <w:b/>
+                <w:sz w:val="19"/>
               </w:rPr>
               <w:t>Root Folder Permissions</w:t>
             </w:r>
@@ -301,18 +254,11 @@
             <w:vAlign w:val="center"/>
           </w:tcPr>
           <w:p>
-            <w:pPr>
-              <w:rPr>
-                <w:sz w:val="21"/>
-                <w:szCs w:val="21"/>
-              </w:rPr>
-            </w:pPr>
             <w:proofErr w:type="spellStart"/>
             <w:r>
               <w:rPr>
                 <w:rFonts w:ascii="Arial" w:eastAsia="Arial" w:hAnsi="Arial" w:cs="Arial"/>
-                <w:sz w:val="21"/>
-                <w:szCs w:val="21"/>
+                <w:sz w:val="19"/>
               </w:rPr>
               <w:t>CloudFuze</w:t>
             </w:r>
@@ -320,8 +266,7 @@
             <w:r>
               <w:rPr>
                 <w:rFonts w:ascii="Arial" w:eastAsia="Arial" w:hAnsi="Arial" w:cs="Arial"/>
-                <w:sz w:val="21"/>
-                <w:szCs w:val="21"/>
+                <w:sz w:val="19"/>
               </w:rPr>
               <w:t xml:space="preserve"> preserves all root folder permissions along with access levels.</w:t>
             </w:r>
@@ -345,17 +290,12 @@
           <w:p>
             <w:pPr>
               <w:ind w:left="3"/>
-              <w:rPr>
-                <w:sz w:val="21"/>
-                <w:szCs w:val="21"/>
-              </w:rPr>
-            </w:pPr>
-            <w:r>
-              <w:rPr>
-                <w:rFonts w:ascii="Arial" w:eastAsia="Arial" w:hAnsi="Arial" w:cs="Arial"/>
-                <w:b/>
-                <w:sz w:val="21"/>
-                <w:szCs w:val="21"/>
+            </w:pPr>
+            <w:r>
+              <w:rPr>
+                <w:rFonts w:ascii="Arial" w:eastAsia="Arial" w:hAnsi="Arial" w:cs="Arial"/>
+                <w:b/>
+                <w:sz w:val="19"/>
               </w:rPr>
               <w:t>Root File Permissions</w:t>
             </w:r>
@@ -372,18 +312,11 @@
             </w:tcBorders>
           </w:tcPr>
           <w:p>
-            <w:pPr>
-              <w:rPr>
-                <w:sz w:val="21"/>
-                <w:szCs w:val="21"/>
-              </w:rPr>
-            </w:pPr>
             <w:proofErr w:type="spellStart"/>
             <w:r>
               <w:rPr>
                 <w:rFonts w:ascii="Arial" w:eastAsia="Arial" w:hAnsi="Arial" w:cs="Arial"/>
-                <w:sz w:val="21"/>
-                <w:szCs w:val="21"/>
+                <w:sz w:val="19"/>
               </w:rPr>
               <w:t>CloudFuze</w:t>
             </w:r>
@@ -391,8 +324,7 @@
             <w:r>
               <w:rPr>
                 <w:rFonts w:ascii="Arial" w:eastAsia="Arial" w:hAnsi="Arial" w:cs="Arial"/>
-                <w:sz w:val="21"/>
-                <w:szCs w:val="21"/>
+                <w:sz w:val="19"/>
               </w:rPr>
               <w:t xml:space="preserve"> preserves all Root file permissions along with access levels.</w:t>
             </w:r>
@@ -416,17 +348,12 @@
           <w:p>
             <w:pPr>
               <w:ind w:left="3"/>
-              <w:rPr>
-                <w:sz w:val="21"/>
-                <w:szCs w:val="21"/>
-              </w:rPr>
-            </w:pPr>
-            <w:r>
-              <w:rPr>
-                <w:rFonts w:ascii="Arial" w:eastAsia="Arial" w:hAnsi="Arial" w:cs="Arial"/>
-                <w:b/>
-                <w:sz w:val="21"/>
-                <w:szCs w:val="21"/>
+            </w:pPr>
+            <w:r>
+              <w:rPr>
+                <w:rFonts w:ascii="Arial" w:eastAsia="Arial" w:hAnsi="Arial" w:cs="Arial"/>
+                <w:b/>
+                <w:sz w:val="19"/>
               </w:rPr>
               <w:t>Sub-folder permissions</w:t>
             </w:r>
@@ -443,18 +370,11 @@
             </w:tcBorders>
           </w:tcPr>
           <w:p>
-            <w:pPr>
-              <w:rPr>
-                <w:sz w:val="21"/>
-                <w:szCs w:val="21"/>
-              </w:rPr>
-            </w:pPr>
             <w:proofErr w:type="spellStart"/>
             <w:r>
               <w:rPr>
                 <w:rFonts w:ascii="Arial" w:eastAsia="Arial" w:hAnsi="Arial" w:cs="Arial"/>
-                <w:sz w:val="21"/>
-                <w:szCs w:val="21"/>
+                <w:sz w:val="19"/>
               </w:rPr>
               <w:t>CloudFuze</w:t>
             </w:r>
@@ -462,8 +382,7 @@
             <w:r>
               <w:rPr>
                 <w:rFonts w:ascii="Arial" w:eastAsia="Arial" w:hAnsi="Arial" w:cs="Arial"/>
-                <w:sz w:val="21"/>
-                <w:szCs w:val="21"/>
+                <w:sz w:val="19"/>
               </w:rPr>
               <w:t xml:space="preserve"> preserves all subfolder permissions along with access levels.</w:t>
             </w:r>
@@ -487,17 +406,12 @@
           <w:p>
             <w:pPr>
               <w:ind w:left="3"/>
-              <w:rPr>
-                <w:sz w:val="21"/>
-                <w:szCs w:val="21"/>
-              </w:rPr>
-            </w:pPr>
-            <w:r>
-              <w:rPr>
-                <w:rFonts w:ascii="Arial" w:eastAsia="Arial" w:hAnsi="Arial" w:cs="Arial"/>
-                <w:b/>
-                <w:sz w:val="21"/>
-                <w:szCs w:val="21"/>
+            </w:pPr>
+            <w:r>
+              <w:rPr>
+                <w:rFonts w:ascii="Arial" w:eastAsia="Arial" w:hAnsi="Arial" w:cs="Arial"/>
+                <w:b/>
+                <w:sz w:val="19"/>
               </w:rPr>
               <w:t>External Shares</w:t>
             </w:r>
@@ -515,18 +429,11 @@
             <w:vAlign w:val="center"/>
           </w:tcPr>
           <w:p>
-            <w:pPr>
-              <w:rPr>
-                <w:sz w:val="21"/>
-                <w:szCs w:val="21"/>
-              </w:rPr>
-            </w:pPr>
             <w:proofErr w:type="spellStart"/>
             <w:r>
               <w:rPr>
                 <w:rFonts w:ascii="Arial" w:eastAsia="Arial" w:hAnsi="Arial" w:cs="Arial"/>
-                <w:sz w:val="21"/>
-                <w:szCs w:val="21"/>
+                <w:sz w:val="19"/>
               </w:rPr>
               <w:t>CloudFuze</w:t>
             </w:r>
@@ -534,8 +441,7 @@
             <w:r>
               <w:rPr>
                 <w:rFonts w:ascii="Arial" w:eastAsia="Arial" w:hAnsi="Arial" w:cs="Arial"/>
-                <w:sz w:val="21"/>
-                <w:szCs w:val="21"/>
+                <w:sz w:val="19"/>
               </w:rPr>
               <w:t xml:space="preserve"> can migrate external permissions (Files/Folders shared with people of outside organizations) of files/folders to the destination along with access levels.</w:t>
             </w:r>
@@ -559,17 +465,12 @@
           <w:p>
             <w:pPr>
               <w:ind w:left="3"/>
-              <w:rPr>
-                <w:sz w:val="21"/>
-                <w:szCs w:val="21"/>
-              </w:rPr>
-            </w:pPr>
-            <w:r>
-              <w:rPr>
-                <w:rFonts w:ascii="Arial" w:eastAsia="Arial" w:hAnsi="Arial" w:cs="Arial"/>
-                <w:b/>
-                <w:sz w:val="21"/>
-                <w:szCs w:val="21"/>
+            </w:pPr>
+            <w:r>
+              <w:rPr>
+                <w:rFonts w:ascii="Arial" w:eastAsia="Arial" w:hAnsi="Arial" w:cs="Arial"/>
+                <w:b/>
+                <w:sz w:val="19"/>
               </w:rPr>
               <w:t>Version History</w:t>
             </w:r>
@@ -586,17 +487,10 @@
             </w:tcBorders>
           </w:tcPr>
           <w:p>
-            <w:pPr>
-              <w:rPr>
-                <w:sz w:val="21"/>
-                <w:szCs w:val="21"/>
-              </w:rPr>
-            </w:pPr>
-            <w:r>
-              <w:rPr>
-                <w:rFonts w:ascii="Arial" w:eastAsia="Arial" w:hAnsi="Arial" w:cs="Arial"/>
-                <w:sz w:val="21"/>
-                <w:szCs w:val="21"/>
+            <w:r>
+              <w:rPr>
+                <w:rFonts w:ascii="Arial" w:eastAsia="Arial" w:hAnsi="Arial" w:cs="Arial"/>
+                <w:sz w:val="19"/>
               </w:rPr>
               <w:t>Migration of all file versions from source to destination.</w:t>
             </w:r>
@@ -620,17 +514,12 @@
           <w:p>
             <w:pPr>
               <w:ind w:left="3"/>
-              <w:rPr>
-                <w:sz w:val="21"/>
-                <w:szCs w:val="21"/>
-              </w:rPr>
-            </w:pPr>
-            <w:r>
-              <w:rPr>
-                <w:rFonts w:ascii="Arial" w:eastAsia="Arial" w:hAnsi="Arial" w:cs="Arial"/>
-                <w:b/>
-                <w:sz w:val="21"/>
-                <w:szCs w:val="21"/>
+            </w:pPr>
+            <w:r>
+              <w:rPr>
+                <w:rFonts w:ascii="Arial" w:eastAsia="Arial" w:hAnsi="Arial" w:cs="Arial"/>
+                <w:b/>
+                <w:sz w:val="19"/>
               </w:rPr>
               <w:t>Metadata</w:t>
             </w:r>
@@ -647,17 +536,10 @@
             </w:tcBorders>
           </w:tcPr>
           <w:p>
-            <w:pPr>
-              <w:rPr>
-                <w:sz w:val="21"/>
-                <w:szCs w:val="21"/>
-              </w:rPr>
-            </w:pPr>
-            <w:r>
-              <w:rPr>
-                <w:rFonts w:ascii="Arial" w:eastAsia="Arial" w:hAnsi="Arial" w:cs="Arial"/>
-                <w:sz w:val="21"/>
-                <w:szCs w:val="21"/>
+            <w:r>
+              <w:rPr>
+                <w:rFonts w:ascii="Arial" w:eastAsia="Arial" w:hAnsi="Arial" w:cs="Arial"/>
+                <w:sz w:val="19"/>
               </w:rPr>
               <w:t>Maintaining the original timestamps, including creation and modification dates and times, when transferring data to the destination cloud.</w:t>
             </w:r>
@@ -681,17 +563,12 @@
           <w:p>
             <w:pPr>
               <w:ind w:left="3"/>
-              <w:rPr>
-                <w:sz w:val="21"/>
-                <w:szCs w:val="21"/>
-              </w:rPr>
-            </w:pPr>
-            <w:r>
-              <w:rPr>
-                <w:rFonts w:ascii="Arial" w:eastAsia="Arial" w:hAnsi="Arial" w:cs="Arial"/>
-                <w:b/>
-                <w:sz w:val="21"/>
-                <w:szCs w:val="21"/>
+            </w:pPr>
+            <w:r>
+              <w:rPr>
+                <w:rFonts w:ascii="Arial" w:eastAsia="Arial" w:hAnsi="Arial" w:cs="Arial"/>
+                <w:b/>
+                <w:sz w:val="19"/>
               </w:rPr>
               <w:t>Special Characters Replacement</w:t>
             </w:r>
@@ -710,16 +587,11 @@
           <w:p>
             <w:pPr>
               <w:ind w:right="14"/>
-              <w:rPr>
-                <w:sz w:val="21"/>
-                <w:szCs w:val="21"/>
-              </w:rPr>
-            </w:pPr>
-            <w:r>
-              <w:rPr>
-                <w:rFonts w:ascii="Arial" w:eastAsia="Arial" w:hAnsi="Arial" w:cs="Arial"/>
-                <w:sz w:val="21"/>
-                <w:szCs w:val="21"/>
+            </w:pPr>
+            <w:r>
+              <w:rPr>
+                <w:rFonts w:ascii="Arial" w:eastAsia="Arial" w:hAnsi="Arial" w:cs="Arial"/>
+                <w:sz w:val="19"/>
               </w:rPr>
               <w:t>Special characters not supported by the destination cloud will be automatically replaced with underscores (_) or hyphens (-). This ensures that the integrity of the data is maintained during the migration process.</w:t>
             </w:r>
@@ -743,17 +615,12 @@
           <w:p>
             <w:pPr>
               <w:ind w:left="3"/>
-              <w:rPr>
-                <w:sz w:val="21"/>
-                <w:szCs w:val="21"/>
-              </w:rPr>
-            </w:pPr>
-            <w:r>
-              <w:rPr>
-                <w:rFonts w:ascii="Arial" w:eastAsia="Arial" w:hAnsi="Arial" w:cs="Arial"/>
-                <w:b/>
-                <w:sz w:val="21"/>
-                <w:szCs w:val="21"/>
+            </w:pPr>
+            <w:r>
+              <w:rPr>
+                <w:rFonts w:ascii="Arial" w:eastAsia="Arial" w:hAnsi="Arial" w:cs="Arial"/>
+                <w:b/>
+                <w:sz w:val="19"/>
               </w:rPr>
               <w:t>Long-File/folder path</w:t>
             </w:r>
@@ -771,17 +638,10 @@
             <w:vAlign w:val="center"/>
           </w:tcPr>
           <w:p>
-            <w:pPr>
-              <w:rPr>
-                <w:sz w:val="21"/>
-                <w:szCs w:val="21"/>
-              </w:rPr>
-            </w:pPr>
-            <w:r>
-              <w:rPr>
-                <w:rFonts w:ascii="Arial" w:eastAsia="Arial" w:hAnsi="Arial" w:cs="Arial"/>
-                <w:sz w:val="21"/>
-                <w:szCs w:val="21"/>
+            <w:r>
+              <w:rPr>
+                <w:rFonts w:ascii="Arial" w:eastAsia="Arial" w:hAnsi="Arial" w:cs="Arial"/>
+                <w:sz w:val="19"/>
               </w:rPr>
               <w:t>If the destination cloud has a long folder path limitation, the system automatically adjusts the destination's path as per the limitation.</w:t>
             </w:r>
@@ -805,17 +665,12 @@
           <w:p>
             <w:pPr>
               <w:ind w:left="3"/>
-              <w:rPr>
-                <w:sz w:val="21"/>
-                <w:szCs w:val="21"/>
-              </w:rPr>
-            </w:pPr>
-            <w:r>
-              <w:rPr>
-                <w:rFonts w:ascii="Arial" w:eastAsia="Arial" w:hAnsi="Arial" w:cs="Arial"/>
-                <w:b/>
-                <w:sz w:val="21"/>
-                <w:szCs w:val="21"/>
+            </w:pPr>
+            <w:r>
+              <w:rPr>
+                <w:rFonts w:ascii="Arial" w:eastAsia="Arial" w:hAnsi="Arial" w:cs="Arial"/>
+                <w:b/>
+                <w:sz w:val="19"/>
               </w:rPr>
               <w:t>Auto-Retry</w:t>
             </w:r>
@@ -832,17 +687,10 @@
             </w:tcBorders>
           </w:tcPr>
           <w:p>
-            <w:pPr>
-              <w:rPr>
-                <w:sz w:val="21"/>
-                <w:szCs w:val="21"/>
-              </w:rPr>
-            </w:pPr>
-            <w:r>
-              <w:rPr>
-                <w:rFonts w:ascii="Arial" w:eastAsia="Arial" w:hAnsi="Arial" w:cs="Arial"/>
-                <w:sz w:val="21"/>
-                <w:szCs w:val="21"/>
+            <w:r>
+              <w:rPr>
+                <w:rFonts w:ascii="Arial" w:eastAsia="Arial" w:hAnsi="Arial" w:cs="Arial"/>
+                <w:sz w:val="19"/>
               </w:rPr>
               <w:t>The system will automatically prevent the generation of email notifications for collaborations on folders/files originating from the destination cloud.</w:t>
             </w:r>
@@ -866,17 +714,12 @@
           <w:p>
             <w:pPr>
               <w:ind w:left="3"/>
-              <w:rPr>
-                <w:sz w:val="21"/>
-                <w:szCs w:val="21"/>
-              </w:rPr>
-            </w:pPr>
-            <w:r>
-              <w:rPr>
-                <w:rFonts w:ascii="Arial" w:eastAsia="Arial" w:hAnsi="Arial" w:cs="Arial"/>
-                <w:b/>
-                <w:sz w:val="21"/>
-                <w:szCs w:val="21"/>
+            </w:pPr>
+            <w:r>
+              <w:rPr>
+                <w:rFonts w:ascii="Arial" w:eastAsia="Arial" w:hAnsi="Arial" w:cs="Arial"/>
+                <w:b/>
+                <w:sz w:val="19"/>
               </w:rPr>
               <w:t>Suppress email notifications</w:t>
             </w:r>
@@ -894,17 +737,10 @@
             <w:vAlign w:val="center"/>
           </w:tcPr>
           <w:p>
-            <w:pPr>
-              <w:rPr>
-                <w:sz w:val="21"/>
-                <w:szCs w:val="21"/>
-              </w:rPr>
-            </w:pPr>
-            <w:r>
-              <w:rPr>
-                <w:rFonts w:ascii="Arial" w:eastAsia="Arial" w:hAnsi="Arial" w:cs="Arial"/>
-                <w:sz w:val="21"/>
-                <w:szCs w:val="21"/>
+            <w:r>
+              <w:rPr>
+                <w:rFonts w:ascii="Arial" w:eastAsia="Arial" w:hAnsi="Arial" w:cs="Arial"/>
+                <w:sz w:val="19"/>
               </w:rPr>
               <w:t>The system will automatically prevent the generation of email notifications for collaborations on folders/files originating from the destination cloud.</w:t>
             </w:r>
@@ -1080,56 +916,56 @@
                 <w:b/>
                 <w:sz w:val="21"/>
               </w:rPr>
+              <w:t>One Time Migration</w:t>
+            </w:r>
+          </w:p>
+        </w:tc>
+        <w:tc>
+          <w:tcPr>
+            <w:tcW w:w="6208" w:type="dxa"/>
+            <w:tcBorders>
+              <w:top w:val="single" w:sz="6" w:space="0" w:color="666666"/>
+              <w:left w:val="single" w:sz="6" w:space="0" w:color="666666"/>
+              <w:bottom w:val="single" w:sz="6" w:space="0" w:color="666666"/>
+              <w:right w:val="single" w:sz="6" w:space="0" w:color="666666"/>
+            </w:tcBorders>
+          </w:tcPr>
+          <w:p>
+            <w:pPr>
+              <w:ind w:left="1"/>
+            </w:pPr>
+            <w:r>
+              <w:rPr>
+                <w:rFonts w:ascii="Arial" w:eastAsia="Arial" w:hAnsi="Arial" w:cs="Arial"/>
+                <w:sz w:val="21"/>
+              </w:rPr>
+              <w:t>The initial data migration from source to destination is considered as One-time migration.</w:t>
+            </w:r>
+          </w:p>
+        </w:tc>
+      </w:tr>
+      <w:tr>
+        <w:trPr>
+          <w:trHeight w:val="660"/>
+        </w:trPr>
+        <w:tc>
+          <w:tcPr>
+            <w:tcW w:w="4513" w:type="dxa"/>
+            <w:tcBorders>
+              <w:top w:val="single" w:sz="6" w:space="0" w:color="666666"/>
+              <w:left w:val="single" w:sz="6" w:space="0" w:color="666666"/>
+              <w:bottom w:val="single" w:sz="6" w:space="0" w:color="666666"/>
+              <w:right w:val="single" w:sz="6" w:space="0" w:color="666666"/>
+            </w:tcBorders>
+          </w:tcPr>
+          <w:p>
+            <w:r>
+              <w:rPr>
+                <w:rFonts w:ascii="Arial" w:eastAsia="Arial" w:hAnsi="Arial" w:cs="Arial"/>
+                <w:b/>
+                <w:sz w:val="21"/>
+              </w:rPr>
               <w:lastRenderedPageBreak/>
-              <w:t>One Time Migration</w:t>
-            </w:r>
-          </w:p>
-        </w:tc>
-        <w:tc>
-          <w:tcPr>
-            <w:tcW w:w="6208" w:type="dxa"/>
-            <w:tcBorders>
-              <w:top w:val="single" w:sz="6" w:space="0" w:color="666666"/>
-              <w:left w:val="single" w:sz="6" w:space="0" w:color="666666"/>
-              <w:bottom w:val="single" w:sz="6" w:space="0" w:color="666666"/>
-              <w:right w:val="single" w:sz="6" w:space="0" w:color="666666"/>
-            </w:tcBorders>
-          </w:tcPr>
-          <w:p>
-            <w:pPr>
-              <w:ind w:left="1"/>
-            </w:pPr>
-            <w:r>
-              <w:rPr>
-                <w:rFonts w:ascii="Arial" w:eastAsia="Arial" w:hAnsi="Arial" w:cs="Arial"/>
-                <w:sz w:val="21"/>
-              </w:rPr>
-              <w:t>The initial data migration from source to destination is considered as One-time migration.</w:t>
-            </w:r>
-          </w:p>
-        </w:tc>
-      </w:tr>
-      <w:tr>
-        <w:trPr>
-          <w:trHeight w:val="660"/>
-        </w:trPr>
-        <w:tc>
-          <w:tcPr>
-            <w:tcW w:w="4513" w:type="dxa"/>
-            <w:tcBorders>
-              <w:top w:val="single" w:sz="6" w:space="0" w:color="666666"/>
-              <w:left w:val="single" w:sz="6" w:space="0" w:color="666666"/>
-              <w:bottom w:val="single" w:sz="6" w:space="0" w:color="666666"/>
-              <w:right w:val="single" w:sz="6" w:space="0" w:color="666666"/>
-            </w:tcBorders>
-          </w:tcPr>
-          <w:p>
-            <w:r>
-              <w:rPr>
-                <w:rFonts w:ascii="Arial" w:eastAsia="Arial" w:hAnsi="Arial" w:cs="Arial"/>
-                <w:b/>
-                <w:sz w:val="21"/>
-              </w:rPr>
               <w:t>Delta Migration</w:t>
             </w:r>
           </w:p>

</xml_diff>